<commit_message>
W30 StoreNext: fix wrong product numbers (Meteor->Supplier Portal), false Gartner attribution, weak product pivot per Ran's review
</commit_message>
<xml_diff>
--- a/O-output/W30/final/article.docx
+++ b/O-output/W30/final/article.docx
@@ -143,7 +143,7 @@
         <w:pStyle w:val="Heading2"/>
       </w:pPr>
       <w:r>
-        <w:t>The Prerequisite Gartner Doesn't Name Directly</w:t>
+        <w:t>The Prerequisite Beyond Gartner's Guidance</w:t>
       </w:r>
     </w:p>
     <w:p>
@@ -223,7 +223,7 @@
         <w:rPr>
           <w:b w:val="0"/>
         </w:rPr>
-        <w:t>That sequence is the control gate Gartner describes, applied to the process where CFOs have the most transaction volume and the least tolerance for error. StoreNext supports more than 1,000 ERP integrations and serves 400+ Enterprise clients on this infrastructure. The audit trail exists at scale before any AI capability touches it.</w:t>
+        <w:t>That sequence is what a control gate looks like in practice, applied to the process where CFOs have the most transaction volume and the least tolerance for error. StoreNext runs this infrastructure across 300+ Enterprise clients and 3 million transactions a day. The audit trail exists at scale before any AI capability touches it.</w:t>
       </w:r>
     </w:p>
     <w:p>
@@ -337,7 +337,7 @@
         <w:rPr>
           <w:b w:val="0"/>
         </w:rPr>
-        <w:t>The distinction Gartner drew across three headlines at one conference comes down to a single operating principle. AI deployment is not value creation. Governance, applied to a process with an existing audit trail, is what turns deployment into competitive advantage.</w:t>
+        <w:t>Our takeaway from three headlines at one conference comes down to a single operating principle. AI deployment is not value creation. Governance, applied to a process with an existing audit trail, is what turns deployment into competitive advantage.</w:t>
       </w:r>
     </w:p>
     <w:p>

</xml_diff>